<commit_message>
Update slides for last couple years run
</commit_message>
<xml_diff>
--- a/old_2020_2023/lab3/Lab3Procedure.docx
+++ b/old_2020_2023/lab3/Lab3Procedure.docx
@@ -1,6 +1,6 @@
 
 <file path=word/document.xml><?xml version="1.0" encoding="utf-8"?>
-<w:document xmlns:wpc="http://schemas.microsoft.com/office/word/2010/wordprocessingCanvas" xmlns:cx="http://schemas.microsoft.com/office/drawing/2014/chartex" xmlns:cx1="http://schemas.microsoft.com/office/drawing/2015/9/8/chartex" xmlns:cx2="http://schemas.microsoft.com/office/drawing/2015/10/21/chartex" xmlns:cx3="http://schemas.microsoft.com/office/drawing/2016/5/9/chartex" xmlns:cx4="http://schemas.microsoft.com/office/drawing/2016/5/10/chartex" xmlns:cx5="http://schemas.microsoft.com/office/drawing/2016/5/11/chartex" xmlns:cx6="http://schemas.microsoft.com/office/drawing/2016/5/12/chartex" xmlns:cx7="http://schemas.microsoft.com/office/drawing/2016/5/13/chartex" xmlns:cx8="http://schemas.microsoft.com/office/drawing/2016/5/14/chartex" xmlns:mc="http://schemas.openxmlformats.org/markup-compatibility/2006" xmlns:aink="http://schemas.microsoft.com/office/drawing/2016/ink" xmlns:am3d="http://schemas.microsoft.com/office/drawing/2017/model3d" xmlns:o="urn:schemas-microsoft-com:office:office" xmlns:oel="http://schemas.microsoft.com/office/2019/extlst" xmlns:r="http://schemas.openxmlformats.org/officeDocument/2006/relationships" xmlns:m="http://schemas.openxmlformats.org/officeDocument/2006/math" xmlns:v="urn:schemas-microsoft-com:vml" xmlns:wp14="http://schemas.microsoft.com/office/word/2010/wordprocessingDrawing" xmlns:wp="http://schemas.openxmlformats.org/drawingml/2006/wordprocessingDrawing" xmlns:w10="urn:schemas-microsoft-com:office:word" xmlns:w="http://schemas.openxmlformats.org/wordprocessingml/2006/main" xmlns:w14="http://schemas.microsoft.com/office/word/2010/wordml" xmlns:w15="http://schemas.microsoft.com/office/word/2012/wordml" xmlns:w16cex="http://schemas.microsoft.com/office/word/2018/wordml/cex" xmlns:w16cid="http://schemas.microsoft.com/office/word/2016/wordml/cid" xmlns:w16="http://schemas.microsoft.com/office/word/2018/wordml" xmlns:w16sdtdh="http://schemas.microsoft.com/office/word/2020/wordml/sdtdatahash" xmlns:w16se="http://schemas.microsoft.com/office/word/2015/wordml/symex" xmlns:wpg="http://schemas.microsoft.com/office/word/2010/wordprocessingGroup" xmlns:wpi="http://schemas.microsoft.com/office/word/2010/wordprocessingInk" xmlns:wne="http://schemas.microsoft.com/office/word/2006/wordml" xmlns:wps="http://schemas.microsoft.com/office/word/2010/wordprocessingShape" mc:Ignorable="w14 w15 w16se w16cid w16 w16cex w16sdtdh wp14">
+<w:document xmlns:wpc="http://schemas.microsoft.com/office/word/2010/wordprocessingCanvas" xmlns:cx="http://schemas.microsoft.com/office/drawing/2014/chartex" xmlns:cx1="http://schemas.microsoft.com/office/drawing/2015/9/8/chartex" xmlns:cx2="http://schemas.microsoft.com/office/drawing/2015/10/21/chartex" xmlns:cx3="http://schemas.microsoft.com/office/drawing/2016/5/9/chartex" xmlns:cx4="http://schemas.microsoft.com/office/drawing/2016/5/10/chartex" xmlns:cx5="http://schemas.microsoft.com/office/drawing/2016/5/11/chartex" xmlns:cx6="http://schemas.microsoft.com/office/drawing/2016/5/12/chartex" xmlns:cx7="http://schemas.microsoft.com/office/drawing/2016/5/13/chartex" xmlns:cx8="http://schemas.microsoft.com/office/drawing/2016/5/14/chartex" xmlns:mc="http://schemas.openxmlformats.org/markup-compatibility/2006" xmlns:aink="http://schemas.microsoft.com/office/drawing/2016/ink" xmlns:am3d="http://schemas.microsoft.com/office/drawing/2017/model3d" xmlns:o="urn:schemas-microsoft-com:office:office" xmlns:oel="http://schemas.microsoft.com/office/2019/extlst" xmlns:r="http://schemas.openxmlformats.org/officeDocument/2006/relationships" xmlns:m="http://schemas.openxmlformats.org/officeDocument/2006/math" xmlns:v="urn:schemas-microsoft-com:vml" xmlns:wp14="http://schemas.microsoft.com/office/word/2010/wordprocessingDrawing" xmlns:wp="http://schemas.openxmlformats.org/drawingml/2006/wordprocessingDrawing" xmlns:w10="urn:schemas-microsoft-com:office:word" xmlns:w="http://schemas.openxmlformats.org/wordprocessingml/2006/main" xmlns:w14="http://schemas.microsoft.com/office/word/2010/wordml" xmlns:w15="http://schemas.microsoft.com/office/word/2012/wordml" xmlns:w16cex="http://schemas.microsoft.com/office/word/2018/wordml/cex" xmlns:w16cid="http://schemas.microsoft.com/office/word/2016/wordml/cid" xmlns:w16="http://schemas.microsoft.com/office/word/2018/wordml" xmlns:w16du="http://schemas.microsoft.com/office/word/2023/wordml/word16du" xmlns:w16sdtdh="http://schemas.microsoft.com/office/word/2020/wordml/sdtdatahash" xmlns:w16sdtfl="http://schemas.microsoft.com/office/word/2024/wordml/sdtformatlock" xmlns:w16se="http://schemas.microsoft.com/office/word/2015/wordml/symex" xmlns:wpg="http://schemas.microsoft.com/office/word/2010/wordprocessingGroup" xmlns:wpi="http://schemas.microsoft.com/office/word/2010/wordprocessingInk" xmlns:wne="http://schemas.microsoft.com/office/word/2006/wordml" xmlns:wps="http://schemas.microsoft.com/office/word/2010/wordprocessingShape" mc:Ignorable="w14 w15 w16se w16cid w16 w16cex w16sdtdh w16sdtfl w16du wp14">
   <w:body>
     <w:p>
       <w:pPr>
@@ -67,11 +67,19 @@
         </w:rPr>
         <w:t xml:space="preserve">Step 1: </w:t>
       </w:r>
-      <w:r>
-        <w:rPr>
-          <w:lang w:val="en-US"/>
-        </w:rPr>
-        <w:t>Ghidra Setup &amp; Testing</w:t>
+      <w:proofErr w:type="spellStart"/>
+      <w:r>
+        <w:rPr>
+          <w:lang w:val="en-US"/>
+        </w:rPr>
+        <w:t>Ghidra</w:t>
+      </w:r>
+      <w:proofErr w:type="spellEnd"/>
+      <w:r>
+        <w:rPr>
+          <w:lang w:val="en-US"/>
+        </w:rPr>
+        <w:t xml:space="preserve"> Setup &amp; Testing</w:t>
       </w:r>
     </w:p>
     <w:p>
@@ -96,7 +104,21 @@
         <w:rPr>
           <w:lang w:val="en-US"/>
         </w:rPr>
-        <w:t>Follow the Ghidra Installation instructions:</w:t>
+        <w:t xml:space="preserve">Follow the </w:t>
+      </w:r>
+      <w:proofErr w:type="spellStart"/>
+      <w:r>
+        <w:rPr>
+          <w:lang w:val="en-US"/>
+        </w:rPr>
+        <w:t>Ghidra</w:t>
+      </w:r>
+      <w:proofErr w:type="spellEnd"/>
+      <w:r>
+        <w:rPr>
+          <w:lang w:val="en-US"/>
+        </w:rPr>
+        <w:t xml:space="preserve"> Installation instructions:</w:t>
       </w:r>
     </w:p>
     <w:p>
@@ -153,7 +175,21 @@
         <w:rPr>
           <w:lang w:val="en-US"/>
         </w:rPr>
-        <w:t xml:space="preserve">For Mac or Linux, see Ghidra installation instructions at </w:t>
+        <w:t xml:space="preserve">For Mac or Linux, see </w:t>
+      </w:r>
+      <w:proofErr w:type="spellStart"/>
+      <w:r>
+        <w:rPr>
+          <w:lang w:val="en-US"/>
+        </w:rPr>
+        <w:t>Ghidra</w:t>
+      </w:r>
+      <w:proofErr w:type="spellEnd"/>
+      <w:r>
+        <w:rPr>
+          <w:lang w:val="en-US"/>
+        </w:rPr>
+        <w:t xml:space="preserve"> installation instructions at </w:t>
       </w:r>
       <w:hyperlink r:id="rId8" w:history="1">
         <w:r>
@@ -189,7 +225,35 @@
         <w:rPr>
           <w:lang w:val="en-US"/>
         </w:rPr>
-        <w:t>Follow along from the video to load the example .hex file &amp; confirm your install is working.</w:t>
+        <w:t>Follow along from the video to load the example .</w:t>
+      </w:r>
+      <w:proofErr w:type="gramStart"/>
+      <w:r>
+        <w:rPr>
+          <w:lang w:val="en-US"/>
+        </w:rPr>
+        <w:t>hex</w:t>
+      </w:r>
+      <w:proofErr w:type="gramEnd"/>
+      <w:r>
+        <w:rPr>
+          <w:lang w:val="en-US"/>
+        </w:rPr>
+        <w:t xml:space="preserve"> file &amp; confirm your </w:t>
+      </w:r>
+      <w:proofErr w:type="gramStart"/>
+      <w:r>
+        <w:rPr>
+          <w:lang w:val="en-US"/>
+        </w:rPr>
+        <w:t>install</w:t>
+      </w:r>
+      <w:proofErr w:type="gramEnd"/>
+      <w:r>
+        <w:rPr>
+          <w:lang w:val="en-US"/>
+        </w:rPr>
+        <w:t xml:space="preserve"> is working.</w:t>
       </w:r>
     </w:p>
     <w:p>
@@ -268,11 +332,19 @@
         </w:rPr>
         <w:t xml:space="preserve">Step 2: </w:t>
       </w:r>
-      <w:r>
-        <w:rPr>
-          <w:lang w:val="en-US"/>
-        </w:rPr>
-        <w:t>Ghidra SVD Loader Setup</w:t>
+      <w:proofErr w:type="spellStart"/>
+      <w:r>
+        <w:rPr>
+          <w:lang w:val="en-US"/>
+        </w:rPr>
+        <w:t>Ghidra</w:t>
+      </w:r>
+      <w:proofErr w:type="spellEnd"/>
+      <w:r>
+        <w:rPr>
+          <w:lang w:val="en-US"/>
+        </w:rPr>
+        <w:t xml:space="preserve"> SVD Loader Setup</w:t>
       </w:r>
     </w:p>
     <w:p>
@@ -483,8 +555,16 @@
         <w:rPr>
           <w:lang w:val="en-US"/>
         </w:rPr>
-        <w:t>lines 0800008 etc</w:t>
-      </w:r>
+        <w:t xml:space="preserve">lines 0800008 </w:t>
+      </w:r>
+      <w:proofErr w:type="spellStart"/>
+      <w:r>
+        <w:rPr>
+          <w:lang w:val="en-US"/>
+        </w:rPr>
+        <w:t>etc</w:t>
+      </w:r>
+      <w:proofErr w:type="spellEnd"/>
       <w:r>
         <w:rPr>
           <w:lang w:val="en-US"/>
@@ -746,7 +826,21 @@
         <w:rPr>
           <w:lang w:val="en-US"/>
         </w:rPr>
-        <w:t>Press “Add”, then select the “SVD-Loader-Ghidra-Master” directory you extracted, and hit OK:</w:t>
+        <w:t>Press “Add”, then select the “SVD-Loader-</w:t>
+      </w:r>
+      <w:proofErr w:type="spellStart"/>
+      <w:r>
+        <w:rPr>
+          <w:lang w:val="en-US"/>
+        </w:rPr>
+        <w:t>Ghidra</w:t>
+      </w:r>
+      <w:proofErr w:type="spellEnd"/>
+      <w:r>
+        <w:rPr>
+          <w:lang w:val="en-US"/>
+        </w:rPr>
+        <w:t>-Master” directory you extracted, and hit OK:</w:t>
       </w:r>
     </w:p>
     <w:p>
@@ -839,27 +933,39 @@
         <w:rPr>
           <w:lang w:val="en-US"/>
         </w:rPr>
-        <w:t>You should find “Leveldown Security” now – run the SVD loader script.</w:t>
-      </w:r>
-    </w:p>
-    <w:p>
-      <w:pPr>
-        <w:pStyle w:val="ListParagraph"/>
-        <w:rPr>
-          <w:lang w:val="en-US"/>
-        </w:rPr>
-      </w:pPr>
+        <w:lastRenderedPageBreak/>
+        <w:t>You should find “</w:t>
+      </w:r>
+      <w:r>
+        <w:rPr>
+          <w:lang w:val="en-US"/>
+        </w:rPr>
+        <w:t>SVD-Loader” now, you can filter on “SVD” (NOTE: Earlier directions indicated there would be a “</w:t>
+      </w:r>
+      <w:proofErr w:type="spellStart"/>
+      <w:r>
+        <w:rPr>
+          <w:lang w:val="en-US"/>
+        </w:rPr>
+        <w:t>leveldown</w:t>
+      </w:r>
+      <w:proofErr w:type="spellEnd"/>
+      <w:r>
+        <w:rPr>
+          <w:lang w:val="en-US"/>
+        </w:rPr>
+        <w:t>” listed on the left side, this might not show up as in below):</w:t>
+      </w:r>
       <w:r>
         <w:rPr>
           <w:noProof/>
           <w:lang w:val="en-US"/>
         </w:rPr>
-        <w:lastRenderedPageBreak/>
         <w:drawing>
-          <wp:inline distT="0" distB="0" distL="0" distR="0" wp14:anchorId="214B453E" wp14:editId="3AE7DD95">
-            <wp:extent cx="4806950" cy="2426610"/>
-            <wp:effectExtent l="0" t="0" r="0" b="0"/>
-            <wp:docPr id="8" name="Picture 8"/>
+          <wp:inline distT="0" distB="0" distL="0" distR="0" wp14:anchorId="4D5BFA1F" wp14:editId="4E7B6B47">
+            <wp:extent cx="4263940" cy="1974148"/>
+            <wp:effectExtent l="0" t="0" r="3810" b="7620"/>
+            <wp:docPr id="1256234504" name="Picture 1"/>
             <wp:cNvGraphicFramePr>
               <a:graphicFrameLocks xmlns:a="http://schemas.openxmlformats.org/drawingml/2006/main" noChangeAspect="1"/>
             </wp:cNvGraphicFramePr>
@@ -867,13 +973,13 @@
               <a:graphicData uri="http://schemas.openxmlformats.org/drawingml/2006/picture">
                 <pic:pic xmlns:pic="http://schemas.openxmlformats.org/drawingml/2006/picture">
                   <pic:nvPicPr>
-                    <pic:cNvPr id="0" name="Picture 5"/>
+                    <pic:cNvPr id="0" name="Picture 1"/>
                     <pic:cNvPicPr>
                       <a:picLocks noChangeAspect="1" noChangeArrowheads="1"/>
                     </pic:cNvPicPr>
                   </pic:nvPicPr>
                   <pic:blipFill>
-                    <a:blip r:embed="rId18" cstate="print">
+                    <a:blip r:embed="rId18">
                       <a:extLst>
                         <a:ext uri="{28A0092B-C50C-407E-A947-70E740481C1C}">
                           <a14:useLocalDpi xmlns:a14="http://schemas.microsoft.com/office/drawing/2010/main" val="0"/>
@@ -888,7 +994,7 @@
                   <pic:spPr bwMode="auto">
                     <a:xfrm>
                       <a:off x="0" y="0"/>
-                      <a:ext cx="4822137" cy="2434277"/>
+                      <a:ext cx="4279645" cy="1981419"/>
                     </a:xfrm>
                     <a:prstGeom prst="rect">
                       <a:avLst/>
@@ -904,14 +1010,6 @@
           </wp:inline>
         </w:drawing>
       </w:r>
-    </w:p>
-    <w:p>
-      <w:pPr>
-        <w:pStyle w:val="ListParagraph"/>
-        <w:rPr>
-          <w:lang w:val="en-US"/>
-        </w:rPr>
-      </w:pPr>
     </w:p>
     <w:p>
       <w:pPr>
@@ -1098,7 +1196,21 @@
           <w:lang w:val="en-US"/>
         </w:rPr>
         <w:lastRenderedPageBreak/>
-        <w:t>Keep this window open – we will continue to add data to our Ghidra install.</w:t>
+        <w:t xml:space="preserve">Keep this window open – we will continue to add data to our </w:t>
+      </w:r>
+      <w:proofErr w:type="spellStart"/>
+      <w:r>
+        <w:rPr>
+          <w:lang w:val="en-US"/>
+        </w:rPr>
+        <w:t>Ghidra</w:t>
+      </w:r>
+      <w:proofErr w:type="spellEnd"/>
+      <w:r>
+        <w:rPr>
+          <w:lang w:val="en-US"/>
+        </w:rPr>
+        <w:t xml:space="preserve"> install.</w:t>
       </w:r>
     </w:p>
     <w:p>
@@ -1119,7 +1231,21 @@
         <w:rPr>
           <w:lang w:val="en-US"/>
         </w:rPr>
-        <w:t>Step 3: Ghidra Memory Map</w:t>
+        <w:t xml:space="preserve">Step 3: </w:t>
+      </w:r>
+      <w:proofErr w:type="spellStart"/>
+      <w:r>
+        <w:rPr>
+          <w:lang w:val="en-US"/>
+        </w:rPr>
+        <w:t>Ghidra</w:t>
+      </w:r>
+      <w:proofErr w:type="spellEnd"/>
+      <w:r>
+        <w:rPr>
+          <w:lang w:val="en-US"/>
+        </w:rPr>
+        <w:t xml:space="preserve"> Memory Map</w:t>
       </w:r>
     </w:p>
     <w:p>
@@ -1160,7 +1286,7 @@
           <w:lang w:val="en-US"/>
         </w:rPr>
         <w:drawing>
-          <wp:inline distT="0" distB="0" distL="0" distR="0" wp14:anchorId="76B97A2C" wp14:editId="57E3029B">
+          <wp:inline distT="0" distB="0" distL="0" distR="0" wp14:anchorId="76B97A2C" wp14:editId="6496F743">
             <wp:extent cx="2105439" cy="3168650"/>
             <wp:effectExtent l="0" t="0" r="9525" b="0"/>
             <wp:docPr id="12" name="Picture 12"/>
@@ -1405,7 +1531,19 @@
         <w:rPr>
           <w:lang w:val="en-US"/>
         </w:rPr>
-        <w:t xml:space="preserve">Add a new memory segment at address 0x2000000 that is </w:t>
+        <w:t>Add a new memory segment at address 0x2000</w:t>
+      </w:r>
+      <w:r>
+        <w:rPr>
+          <w:lang w:val="en-US"/>
+        </w:rPr>
+        <w:t>0</w:t>
+      </w:r>
+      <w:r>
+        <w:rPr>
+          <w:lang w:val="en-US"/>
+        </w:rPr>
+        <w:t xml:space="preserve">000 that is </w:t>
       </w:r>
       <w:r>
         <w:rPr>
@@ -1661,7 +1799,21 @@
         <w:rPr>
           <w:lang w:val="en-US"/>
         </w:rPr>
-        <w:t>You should now be looking at a ready to roll system!</w:t>
+        <w:t xml:space="preserve">You should now be looking at a </w:t>
+      </w:r>
+      <w:proofErr w:type="gramStart"/>
+      <w:r>
+        <w:rPr>
+          <w:lang w:val="en-US"/>
+        </w:rPr>
+        <w:t>ready to roll</w:t>
+      </w:r>
+      <w:proofErr w:type="gramEnd"/>
+      <w:r>
+        <w:rPr>
+          <w:lang w:val="en-US"/>
+        </w:rPr>
+        <w:t xml:space="preserve"> system!</w:t>
       </w:r>
     </w:p>
     <w:p>
@@ -1696,7 +1848,21 @@
         <w:rPr>
           <w:lang w:val="en-US"/>
         </w:rPr>
-        <w:t>You can now use Ghidra to explore this binary. Some features to work with (see video initially):</w:t>
+        <w:t xml:space="preserve">You can now use </w:t>
+      </w:r>
+      <w:proofErr w:type="spellStart"/>
+      <w:r>
+        <w:rPr>
+          <w:lang w:val="en-US"/>
+        </w:rPr>
+        <w:t>Ghidra</w:t>
+      </w:r>
+      <w:proofErr w:type="spellEnd"/>
+      <w:r>
+        <w:rPr>
+          <w:lang w:val="en-US"/>
+        </w:rPr>
+        <w:t xml:space="preserve"> to explore this binary. Some features to work with (see video initially):</w:t>
       </w:r>
     </w:p>
     <w:p>
@@ -1933,8 +2099,30 @@
         <w:rPr>
           <w:lang w:val="en-US"/>
         </w:rPr>
-        <w:t xml:space="preserve"> [ 30 pts ]</w:t>
-      </w:r>
+        <w:t xml:space="preserve"> </w:t>
+      </w:r>
+      <w:proofErr w:type="gramStart"/>
+      <w:r>
+        <w:rPr>
+          <w:lang w:val="en-US"/>
+        </w:rPr>
+        <w:t>[ 30</w:t>
+      </w:r>
+      <w:proofErr w:type="gramEnd"/>
+      <w:r>
+        <w:rPr>
+          <w:lang w:val="en-US"/>
+        </w:rPr>
+        <w:t xml:space="preserve"> </w:t>
+      </w:r>
+      <w:proofErr w:type="gramStart"/>
+      <w:r>
+        <w:rPr>
+          <w:lang w:val="en-US"/>
+        </w:rPr>
+        <w:t>pts ]</w:t>
+      </w:r>
+      <w:proofErr w:type="gramEnd"/>
     </w:p>
     <w:p>
       <w:pPr>
@@ -2015,7 +2203,21 @@
         <w:rPr>
           <w:lang w:val="en-US"/>
         </w:rPr>
-        <w:t>ADC1 or ADC2 peripheral? If so what is the address [2 pts]</w:t>
+        <w:t xml:space="preserve">ADC1 or ADC2 peripheral? If </w:t>
+      </w:r>
+      <w:proofErr w:type="gramStart"/>
+      <w:r>
+        <w:rPr>
+          <w:lang w:val="en-US"/>
+        </w:rPr>
+        <w:t>so</w:t>
+      </w:r>
+      <w:proofErr w:type="gramEnd"/>
+      <w:r>
+        <w:rPr>
+          <w:lang w:val="en-US"/>
+        </w:rPr>
+        <w:t xml:space="preserve"> what is the address [2 pts]</w:t>
       </w:r>
     </w:p>
     <w:p>
@@ -2195,7 +2397,7 @@
 </file>
 
 <file path=word/endnotes.xml><?xml version="1.0" encoding="utf-8"?>
-<w:endnotes xmlns:wpc="http://schemas.microsoft.com/office/word/2010/wordprocessingCanvas" xmlns:cx="http://schemas.microsoft.com/office/drawing/2014/chartex" xmlns:cx1="http://schemas.microsoft.com/office/drawing/2015/9/8/chartex" xmlns:cx2="http://schemas.microsoft.com/office/drawing/2015/10/21/chartex" xmlns:cx3="http://schemas.microsoft.com/office/drawing/2016/5/9/chartex" xmlns:cx4="http://schemas.microsoft.com/office/drawing/2016/5/10/chartex" xmlns:cx5="http://schemas.microsoft.com/office/drawing/2016/5/11/chartex" xmlns:cx6="http://schemas.microsoft.com/office/drawing/2016/5/12/chartex" xmlns:cx7="http://schemas.microsoft.com/office/drawing/2016/5/13/chartex" xmlns:cx8="http://schemas.microsoft.com/office/drawing/2016/5/14/chartex" xmlns:mc="http://schemas.openxmlformats.org/markup-compatibility/2006" xmlns:aink="http://schemas.microsoft.com/office/drawing/2016/ink" xmlns:am3d="http://schemas.microsoft.com/office/drawing/2017/model3d" xmlns:o="urn:schemas-microsoft-com:office:office" xmlns:oel="http://schemas.microsoft.com/office/2019/extlst" xmlns:r="http://schemas.openxmlformats.org/officeDocument/2006/relationships" xmlns:m="http://schemas.openxmlformats.org/officeDocument/2006/math" xmlns:v="urn:schemas-microsoft-com:vml" xmlns:wp14="http://schemas.microsoft.com/office/word/2010/wordprocessingDrawing" xmlns:wp="http://schemas.openxmlformats.org/drawingml/2006/wordprocessingDrawing" xmlns:w10="urn:schemas-microsoft-com:office:word" xmlns:w="http://schemas.openxmlformats.org/wordprocessingml/2006/main" xmlns:w14="http://schemas.microsoft.com/office/word/2010/wordml" xmlns:w15="http://schemas.microsoft.com/office/word/2012/wordml" xmlns:w16cex="http://schemas.microsoft.com/office/word/2018/wordml/cex" xmlns:w16cid="http://schemas.microsoft.com/office/word/2016/wordml/cid" xmlns:w16="http://schemas.microsoft.com/office/word/2018/wordml" xmlns:w16sdtdh="http://schemas.microsoft.com/office/word/2020/wordml/sdtdatahash" xmlns:w16se="http://schemas.microsoft.com/office/word/2015/wordml/symex" xmlns:wpg="http://schemas.microsoft.com/office/word/2010/wordprocessingGroup" xmlns:wpi="http://schemas.microsoft.com/office/word/2010/wordprocessingInk" xmlns:wne="http://schemas.microsoft.com/office/word/2006/wordml" xmlns:wps="http://schemas.microsoft.com/office/word/2010/wordprocessingShape" mc:Ignorable="w14 w15 w16se w16cid w16 w16cex w16sdtdh wp14">
+<w:endnotes xmlns:wpc="http://schemas.microsoft.com/office/word/2010/wordprocessingCanvas" xmlns:cx="http://schemas.microsoft.com/office/drawing/2014/chartex" xmlns:cx1="http://schemas.microsoft.com/office/drawing/2015/9/8/chartex" xmlns:cx2="http://schemas.microsoft.com/office/drawing/2015/10/21/chartex" xmlns:cx3="http://schemas.microsoft.com/office/drawing/2016/5/9/chartex" xmlns:cx4="http://schemas.microsoft.com/office/drawing/2016/5/10/chartex" xmlns:cx5="http://schemas.microsoft.com/office/drawing/2016/5/11/chartex" xmlns:cx6="http://schemas.microsoft.com/office/drawing/2016/5/12/chartex" xmlns:cx7="http://schemas.microsoft.com/office/drawing/2016/5/13/chartex" xmlns:cx8="http://schemas.microsoft.com/office/drawing/2016/5/14/chartex" xmlns:mc="http://schemas.openxmlformats.org/markup-compatibility/2006" xmlns:aink="http://schemas.microsoft.com/office/drawing/2016/ink" xmlns:am3d="http://schemas.microsoft.com/office/drawing/2017/model3d" xmlns:o="urn:schemas-microsoft-com:office:office" xmlns:oel="http://schemas.microsoft.com/office/2019/extlst" xmlns:r="http://schemas.openxmlformats.org/officeDocument/2006/relationships" xmlns:m="http://schemas.openxmlformats.org/officeDocument/2006/math" xmlns:v="urn:schemas-microsoft-com:vml" xmlns:wp14="http://schemas.microsoft.com/office/word/2010/wordprocessingDrawing" xmlns:wp="http://schemas.openxmlformats.org/drawingml/2006/wordprocessingDrawing" xmlns:w10="urn:schemas-microsoft-com:office:word" xmlns:w="http://schemas.openxmlformats.org/wordprocessingml/2006/main" xmlns:w14="http://schemas.microsoft.com/office/word/2010/wordml" xmlns:w15="http://schemas.microsoft.com/office/word/2012/wordml" xmlns:w16cex="http://schemas.microsoft.com/office/word/2018/wordml/cex" xmlns:w16cid="http://schemas.microsoft.com/office/word/2016/wordml/cid" xmlns:w16="http://schemas.microsoft.com/office/word/2018/wordml" xmlns:w16du="http://schemas.microsoft.com/office/word/2023/wordml/word16du" xmlns:w16sdtdh="http://schemas.microsoft.com/office/word/2020/wordml/sdtdatahash" xmlns:w16sdtfl="http://schemas.microsoft.com/office/word/2024/wordml/sdtformatlock" xmlns:w16se="http://schemas.microsoft.com/office/word/2015/wordml/symex" xmlns:wpg="http://schemas.microsoft.com/office/word/2010/wordprocessingGroup" xmlns:wpi="http://schemas.microsoft.com/office/word/2010/wordprocessingInk" xmlns:wne="http://schemas.microsoft.com/office/word/2006/wordml" xmlns:wps="http://schemas.microsoft.com/office/word/2010/wordprocessingShape" mc:Ignorable="w14 w15 w16se w16cid w16 w16cex w16sdtdh w16sdtfl w16du wp14">
   <w:endnote w:type="separator" w:id="-1">
     <w:p>
       <w:pPr>
@@ -2220,7 +2422,7 @@
 </file>
 
 <file path=word/footer1.xml><?xml version="1.0" encoding="utf-8"?>
-<w:ftr xmlns:wpc="http://schemas.microsoft.com/office/word/2010/wordprocessingCanvas" xmlns:cx="http://schemas.microsoft.com/office/drawing/2014/chartex" xmlns:cx1="http://schemas.microsoft.com/office/drawing/2015/9/8/chartex" xmlns:cx2="http://schemas.microsoft.com/office/drawing/2015/10/21/chartex" xmlns:cx3="http://schemas.microsoft.com/office/drawing/2016/5/9/chartex" xmlns:cx4="http://schemas.microsoft.com/office/drawing/2016/5/10/chartex" xmlns:cx5="http://schemas.microsoft.com/office/drawing/2016/5/11/chartex" xmlns:cx6="http://schemas.microsoft.com/office/drawing/2016/5/12/chartex" xmlns:cx7="http://schemas.microsoft.com/office/drawing/2016/5/13/chartex" xmlns:cx8="http://schemas.microsoft.com/office/drawing/2016/5/14/chartex" xmlns:mc="http://schemas.openxmlformats.org/markup-compatibility/2006" xmlns:aink="http://schemas.microsoft.com/office/drawing/2016/ink" xmlns:am3d="http://schemas.microsoft.com/office/drawing/2017/model3d" xmlns:o="urn:schemas-microsoft-com:office:office" xmlns:oel="http://schemas.microsoft.com/office/2019/extlst" xmlns:r="http://schemas.openxmlformats.org/officeDocument/2006/relationships" xmlns:m="http://schemas.openxmlformats.org/officeDocument/2006/math" xmlns:v="urn:schemas-microsoft-com:vml" xmlns:wp14="http://schemas.microsoft.com/office/word/2010/wordprocessingDrawing" xmlns:wp="http://schemas.openxmlformats.org/drawingml/2006/wordprocessingDrawing" xmlns:w10="urn:schemas-microsoft-com:office:word" xmlns:w="http://schemas.openxmlformats.org/wordprocessingml/2006/main" xmlns:w14="http://schemas.microsoft.com/office/word/2010/wordml" xmlns:w15="http://schemas.microsoft.com/office/word/2012/wordml" xmlns:w16cex="http://schemas.microsoft.com/office/word/2018/wordml/cex" xmlns:w16cid="http://schemas.microsoft.com/office/word/2016/wordml/cid" xmlns:w16="http://schemas.microsoft.com/office/word/2018/wordml" xmlns:w16sdtdh="http://schemas.microsoft.com/office/word/2020/wordml/sdtdatahash" xmlns:w16se="http://schemas.microsoft.com/office/word/2015/wordml/symex" xmlns:wpg="http://schemas.microsoft.com/office/word/2010/wordprocessingGroup" xmlns:wpi="http://schemas.microsoft.com/office/word/2010/wordprocessingInk" xmlns:wne="http://schemas.microsoft.com/office/word/2006/wordml" xmlns:wps="http://schemas.microsoft.com/office/word/2010/wordprocessingShape" mc:Ignorable="w14 w15 w16se w16cid w16 w16cex w16sdtdh wp14">
+<w:ftr xmlns:wpc="http://schemas.microsoft.com/office/word/2010/wordprocessingCanvas" xmlns:cx="http://schemas.microsoft.com/office/drawing/2014/chartex" xmlns:cx1="http://schemas.microsoft.com/office/drawing/2015/9/8/chartex" xmlns:cx2="http://schemas.microsoft.com/office/drawing/2015/10/21/chartex" xmlns:cx3="http://schemas.microsoft.com/office/drawing/2016/5/9/chartex" xmlns:cx4="http://schemas.microsoft.com/office/drawing/2016/5/10/chartex" xmlns:cx5="http://schemas.microsoft.com/office/drawing/2016/5/11/chartex" xmlns:cx6="http://schemas.microsoft.com/office/drawing/2016/5/12/chartex" xmlns:cx7="http://schemas.microsoft.com/office/drawing/2016/5/13/chartex" xmlns:cx8="http://schemas.microsoft.com/office/drawing/2016/5/14/chartex" xmlns:mc="http://schemas.openxmlformats.org/markup-compatibility/2006" xmlns:aink="http://schemas.microsoft.com/office/drawing/2016/ink" xmlns:am3d="http://schemas.microsoft.com/office/drawing/2017/model3d" xmlns:o="urn:schemas-microsoft-com:office:office" xmlns:oel="http://schemas.microsoft.com/office/2019/extlst" xmlns:r="http://schemas.openxmlformats.org/officeDocument/2006/relationships" xmlns:m="http://schemas.openxmlformats.org/officeDocument/2006/math" xmlns:v="urn:schemas-microsoft-com:vml" xmlns:wp14="http://schemas.microsoft.com/office/word/2010/wordprocessingDrawing" xmlns:wp="http://schemas.openxmlformats.org/drawingml/2006/wordprocessingDrawing" xmlns:w10="urn:schemas-microsoft-com:office:word" xmlns:w="http://schemas.openxmlformats.org/wordprocessingml/2006/main" xmlns:w14="http://schemas.microsoft.com/office/word/2010/wordml" xmlns:w15="http://schemas.microsoft.com/office/word/2012/wordml" xmlns:w16cex="http://schemas.microsoft.com/office/word/2018/wordml/cex" xmlns:w16cid="http://schemas.microsoft.com/office/word/2016/wordml/cid" xmlns:w16="http://schemas.microsoft.com/office/word/2018/wordml" xmlns:w16du="http://schemas.microsoft.com/office/word/2023/wordml/word16du" xmlns:w16sdtdh="http://schemas.microsoft.com/office/word/2020/wordml/sdtdatahash" xmlns:w16sdtfl="http://schemas.microsoft.com/office/word/2024/wordml/sdtformatlock" xmlns:w16se="http://schemas.microsoft.com/office/word/2015/wordml/symex" xmlns:wpg="http://schemas.microsoft.com/office/word/2010/wordprocessingGroup" xmlns:wpi="http://schemas.microsoft.com/office/word/2010/wordprocessingInk" xmlns:wne="http://schemas.microsoft.com/office/word/2006/wordml" xmlns:wps="http://schemas.microsoft.com/office/word/2010/wordprocessingShape" mc:Ignorable="w14 w15 w16se w16cid w16 w16cex w16sdtdh w16sdtfl w16du wp14">
   <w:sdt>
     <w:sdtPr>
       <w:id w:val="723181872"/>
@@ -2272,7 +2474,7 @@
 </file>
 
 <file path=word/footnotes.xml><?xml version="1.0" encoding="utf-8"?>
-<w:footnotes xmlns:wpc="http://schemas.microsoft.com/office/word/2010/wordprocessingCanvas" xmlns:cx="http://schemas.microsoft.com/office/drawing/2014/chartex" xmlns:cx1="http://schemas.microsoft.com/office/drawing/2015/9/8/chartex" xmlns:cx2="http://schemas.microsoft.com/office/drawing/2015/10/21/chartex" xmlns:cx3="http://schemas.microsoft.com/office/drawing/2016/5/9/chartex" xmlns:cx4="http://schemas.microsoft.com/office/drawing/2016/5/10/chartex" xmlns:cx5="http://schemas.microsoft.com/office/drawing/2016/5/11/chartex" xmlns:cx6="http://schemas.microsoft.com/office/drawing/2016/5/12/chartex" xmlns:cx7="http://schemas.microsoft.com/office/drawing/2016/5/13/chartex" xmlns:cx8="http://schemas.microsoft.com/office/drawing/2016/5/14/chartex" xmlns:mc="http://schemas.openxmlformats.org/markup-compatibility/2006" xmlns:aink="http://schemas.microsoft.com/office/drawing/2016/ink" xmlns:am3d="http://schemas.microsoft.com/office/drawing/2017/model3d" xmlns:o="urn:schemas-microsoft-com:office:office" xmlns:oel="http://schemas.microsoft.com/office/2019/extlst" xmlns:r="http://schemas.openxmlformats.org/officeDocument/2006/relationships" xmlns:m="http://schemas.openxmlformats.org/officeDocument/2006/math" xmlns:v="urn:schemas-microsoft-com:vml" xmlns:wp14="http://schemas.microsoft.com/office/word/2010/wordprocessingDrawing" xmlns:wp="http://schemas.openxmlformats.org/drawingml/2006/wordprocessingDrawing" xmlns:w10="urn:schemas-microsoft-com:office:word" xmlns:w="http://schemas.openxmlformats.org/wordprocessingml/2006/main" xmlns:w14="http://schemas.microsoft.com/office/word/2010/wordml" xmlns:w15="http://schemas.microsoft.com/office/word/2012/wordml" xmlns:w16cex="http://schemas.microsoft.com/office/word/2018/wordml/cex" xmlns:w16cid="http://schemas.microsoft.com/office/word/2016/wordml/cid" xmlns:w16="http://schemas.microsoft.com/office/word/2018/wordml" xmlns:w16sdtdh="http://schemas.microsoft.com/office/word/2020/wordml/sdtdatahash" xmlns:w16se="http://schemas.microsoft.com/office/word/2015/wordml/symex" xmlns:wpg="http://schemas.microsoft.com/office/word/2010/wordprocessingGroup" xmlns:wpi="http://schemas.microsoft.com/office/word/2010/wordprocessingInk" xmlns:wne="http://schemas.microsoft.com/office/word/2006/wordml" xmlns:wps="http://schemas.microsoft.com/office/word/2010/wordprocessingShape" mc:Ignorable="w14 w15 w16se w16cid w16 w16cex w16sdtdh wp14">
+<w:footnotes xmlns:wpc="http://schemas.microsoft.com/office/word/2010/wordprocessingCanvas" xmlns:cx="http://schemas.microsoft.com/office/drawing/2014/chartex" xmlns:cx1="http://schemas.microsoft.com/office/drawing/2015/9/8/chartex" xmlns:cx2="http://schemas.microsoft.com/office/drawing/2015/10/21/chartex" xmlns:cx3="http://schemas.microsoft.com/office/drawing/2016/5/9/chartex" xmlns:cx4="http://schemas.microsoft.com/office/drawing/2016/5/10/chartex" xmlns:cx5="http://schemas.microsoft.com/office/drawing/2016/5/11/chartex" xmlns:cx6="http://schemas.microsoft.com/office/drawing/2016/5/12/chartex" xmlns:cx7="http://schemas.microsoft.com/office/drawing/2016/5/13/chartex" xmlns:cx8="http://schemas.microsoft.com/office/drawing/2016/5/14/chartex" xmlns:mc="http://schemas.openxmlformats.org/markup-compatibility/2006" xmlns:aink="http://schemas.microsoft.com/office/drawing/2016/ink" xmlns:am3d="http://schemas.microsoft.com/office/drawing/2017/model3d" xmlns:o="urn:schemas-microsoft-com:office:office" xmlns:oel="http://schemas.microsoft.com/office/2019/extlst" xmlns:r="http://schemas.openxmlformats.org/officeDocument/2006/relationships" xmlns:m="http://schemas.openxmlformats.org/officeDocument/2006/math" xmlns:v="urn:schemas-microsoft-com:vml" xmlns:wp14="http://schemas.microsoft.com/office/word/2010/wordprocessingDrawing" xmlns:wp="http://schemas.openxmlformats.org/drawingml/2006/wordprocessingDrawing" xmlns:w10="urn:schemas-microsoft-com:office:word" xmlns:w="http://schemas.openxmlformats.org/wordprocessingml/2006/main" xmlns:w14="http://schemas.microsoft.com/office/word/2010/wordml" xmlns:w15="http://schemas.microsoft.com/office/word/2012/wordml" xmlns:w16cex="http://schemas.microsoft.com/office/word/2018/wordml/cex" xmlns:w16cid="http://schemas.microsoft.com/office/word/2016/wordml/cid" xmlns:w16="http://schemas.microsoft.com/office/word/2018/wordml" xmlns:w16du="http://schemas.microsoft.com/office/word/2023/wordml/word16du" xmlns:w16sdtdh="http://schemas.microsoft.com/office/word/2020/wordml/sdtdatahash" xmlns:w16sdtfl="http://schemas.microsoft.com/office/word/2024/wordml/sdtformatlock" xmlns:w16se="http://schemas.microsoft.com/office/word/2015/wordml/symex" xmlns:wpg="http://schemas.microsoft.com/office/word/2010/wordprocessingGroup" xmlns:wpi="http://schemas.microsoft.com/office/word/2010/wordprocessingInk" xmlns:wne="http://schemas.microsoft.com/office/word/2006/wordml" xmlns:wps="http://schemas.microsoft.com/office/word/2010/wordprocessingShape" mc:Ignorable="w14 w15 w16se w16cid w16 w16cex w16sdtdh w16sdtfl w16du wp14">
   <w:footnote w:type="separator" w:id="-1">
     <w:p>
       <w:pPr>
@@ -2297,7 +2499,7 @@
 </file>
 
 <file path=word/numbering.xml><?xml version="1.0" encoding="utf-8"?>
-<w:numbering xmlns:wpc="http://schemas.microsoft.com/office/word/2010/wordprocessingCanvas" xmlns:cx="http://schemas.microsoft.com/office/drawing/2014/chartex" xmlns:cx1="http://schemas.microsoft.com/office/drawing/2015/9/8/chartex" xmlns:cx2="http://schemas.microsoft.com/office/drawing/2015/10/21/chartex" xmlns:cx3="http://schemas.microsoft.com/office/drawing/2016/5/9/chartex" xmlns:cx4="http://schemas.microsoft.com/office/drawing/2016/5/10/chartex" xmlns:cx5="http://schemas.microsoft.com/office/drawing/2016/5/11/chartex" xmlns:cx6="http://schemas.microsoft.com/office/drawing/2016/5/12/chartex" xmlns:cx7="http://schemas.microsoft.com/office/drawing/2016/5/13/chartex" xmlns:cx8="http://schemas.microsoft.com/office/drawing/2016/5/14/chartex" xmlns:mc="http://schemas.openxmlformats.org/markup-compatibility/2006" xmlns:aink="http://schemas.microsoft.com/office/drawing/2016/ink" xmlns:am3d="http://schemas.microsoft.com/office/drawing/2017/model3d" xmlns:o="urn:schemas-microsoft-com:office:office" xmlns:oel="http://schemas.microsoft.com/office/2019/extlst" xmlns:r="http://schemas.openxmlformats.org/officeDocument/2006/relationships" xmlns:m="http://schemas.openxmlformats.org/officeDocument/2006/math" xmlns:v="urn:schemas-microsoft-com:vml" xmlns:wp14="http://schemas.microsoft.com/office/word/2010/wordprocessingDrawing" xmlns:wp="http://schemas.openxmlformats.org/drawingml/2006/wordprocessingDrawing" xmlns:w10="urn:schemas-microsoft-com:office:word" xmlns:w="http://schemas.openxmlformats.org/wordprocessingml/2006/main" xmlns:w14="http://schemas.microsoft.com/office/word/2010/wordml" xmlns:w15="http://schemas.microsoft.com/office/word/2012/wordml" xmlns:w16cex="http://schemas.microsoft.com/office/word/2018/wordml/cex" xmlns:w16cid="http://schemas.microsoft.com/office/word/2016/wordml/cid" xmlns:w16="http://schemas.microsoft.com/office/word/2018/wordml" xmlns:w16sdtdh="http://schemas.microsoft.com/office/word/2020/wordml/sdtdatahash" xmlns:w16se="http://schemas.microsoft.com/office/word/2015/wordml/symex" xmlns:wpg="http://schemas.microsoft.com/office/word/2010/wordprocessingGroup" xmlns:wpi="http://schemas.microsoft.com/office/word/2010/wordprocessingInk" xmlns:wne="http://schemas.microsoft.com/office/word/2006/wordml" xmlns:wps="http://schemas.microsoft.com/office/word/2010/wordprocessingShape" mc:Ignorable="w14 w15 w16se w16cid w16 w16cex w16sdtdh wp14">
+<w:numbering xmlns:wpc="http://schemas.microsoft.com/office/word/2010/wordprocessingCanvas" xmlns:cx="http://schemas.microsoft.com/office/drawing/2014/chartex" xmlns:cx1="http://schemas.microsoft.com/office/drawing/2015/9/8/chartex" xmlns:cx2="http://schemas.microsoft.com/office/drawing/2015/10/21/chartex" xmlns:cx3="http://schemas.microsoft.com/office/drawing/2016/5/9/chartex" xmlns:cx4="http://schemas.microsoft.com/office/drawing/2016/5/10/chartex" xmlns:cx5="http://schemas.microsoft.com/office/drawing/2016/5/11/chartex" xmlns:cx6="http://schemas.microsoft.com/office/drawing/2016/5/12/chartex" xmlns:cx7="http://schemas.microsoft.com/office/drawing/2016/5/13/chartex" xmlns:cx8="http://schemas.microsoft.com/office/drawing/2016/5/14/chartex" xmlns:mc="http://schemas.openxmlformats.org/markup-compatibility/2006" xmlns:aink="http://schemas.microsoft.com/office/drawing/2016/ink" xmlns:am3d="http://schemas.microsoft.com/office/drawing/2017/model3d" xmlns:o="urn:schemas-microsoft-com:office:office" xmlns:oel="http://schemas.microsoft.com/office/2019/extlst" xmlns:r="http://schemas.openxmlformats.org/officeDocument/2006/relationships" xmlns:m="http://schemas.openxmlformats.org/officeDocument/2006/math" xmlns:v="urn:schemas-microsoft-com:vml" xmlns:wp14="http://schemas.microsoft.com/office/word/2010/wordprocessingDrawing" xmlns:wp="http://schemas.openxmlformats.org/drawingml/2006/wordprocessingDrawing" xmlns:w10="urn:schemas-microsoft-com:office:word" xmlns:w="http://schemas.openxmlformats.org/wordprocessingml/2006/main" xmlns:w14="http://schemas.microsoft.com/office/word/2010/wordml" xmlns:w15="http://schemas.microsoft.com/office/word/2012/wordml" xmlns:w16cex="http://schemas.microsoft.com/office/word/2018/wordml/cex" xmlns:w16cid="http://schemas.microsoft.com/office/word/2016/wordml/cid" xmlns:w16="http://schemas.microsoft.com/office/word/2018/wordml" xmlns:w16du="http://schemas.microsoft.com/office/word/2023/wordml/word16du" xmlns:w16sdtdh="http://schemas.microsoft.com/office/word/2020/wordml/sdtdatahash" xmlns:w16sdtfl="http://schemas.microsoft.com/office/word/2024/wordml/sdtformatlock" xmlns:w16se="http://schemas.microsoft.com/office/word/2015/wordml/symex" xmlns:wpg="http://schemas.microsoft.com/office/word/2010/wordprocessingGroup" xmlns:wpi="http://schemas.microsoft.com/office/word/2010/wordprocessingInk" xmlns:wne="http://schemas.microsoft.com/office/word/2006/wordml" xmlns:wps="http://schemas.microsoft.com/office/word/2010/wordprocessingShape" mc:Ignorable="w14 w15 w16se w16cid w16 w16cex w16sdtdh w16sdtfl w16du wp14">
   <w:abstractNum w:abstractNumId="0" w15:restartNumberingAfterBreak="0">
     <w:nsid w:val="0B113695"/>
     <w:multiLevelType w:val="hybridMultilevel"/>
@@ -3062,7 +3264,7 @@
 </file>
 
 <file path=word/styles.xml><?xml version="1.0" encoding="utf-8"?>
-<w:styles xmlns:mc="http://schemas.openxmlformats.org/markup-compatibility/2006" xmlns:r="http://schemas.openxmlformats.org/officeDocument/2006/relationships" xmlns:w="http://schemas.openxmlformats.org/wordprocessingml/2006/main" xmlns:w14="http://schemas.microsoft.com/office/word/2010/wordml" xmlns:w15="http://schemas.microsoft.com/office/word/2012/wordml" xmlns:w16cex="http://schemas.microsoft.com/office/word/2018/wordml/cex" xmlns:w16cid="http://schemas.microsoft.com/office/word/2016/wordml/cid" xmlns:w16="http://schemas.microsoft.com/office/word/2018/wordml" xmlns:w16sdtdh="http://schemas.microsoft.com/office/word/2020/wordml/sdtdatahash" xmlns:w16se="http://schemas.microsoft.com/office/word/2015/wordml/symex" mc:Ignorable="w14 w15 w16se w16cid w16 w16cex w16sdtdh">
+<w:styles xmlns:mc="http://schemas.openxmlformats.org/markup-compatibility/2006" xmlns:r="http://schemas.openxmlformats.org/officeDocument/2006/relationships" xmlns:w="http://schemas.openxmlformats.org/wordprocessingml/2006/main" xmlns:w14="http://schemas.microsoft.com/office/word/2010/wordml" xmlns:w15="http://schemas.microsoft.com/office/word/2012/wordml" xmlns:w16cex="http://schemas.microsoft.com/office/word/2018/wordml/cex" xmlns:w16cid="http://schemas.microsoft.com/office/word/2016/wordml/cid" xmlns:w16="http://schemas.microsoft.com/office/word/2018/wordml" xmlns:w16du="http://schemas.microsoft.com/office/word/2023/wordml/word16du" xmlns:w16sdtdh="http://schemas.microsoft.com/office/word/2020/wordml/sdtdatahash" xmlns:w16sdtfl="http://schemas.microsoft.com/office/word/2024/wordml/sdtformatlock" xmlns:w16se="http://schemas.microsoft.com/office/word/2015/wordml/symex" mc:Ignorable="w14 w15 w16se w16cid w16 w16cex w16sdtdh w16sdtfl w16du">
   <w:docDefaults>
     <w:rPrDefault>
       <w:rPr>

</xml_diff>